<commit_message>
Created Post API definitions in Post_APIs.docx.
</commit_message>
<xml_diff>
--- a/Portal_Database_Design/Post_APIs.docx
+++ b/Portal_Database_Design/Post_APIs.docx
@@ -16,17 +16,17 @@
         </w:tblCellMar>
       </w:tblPr>
       <w:tblGrid>
-        <w:gridCol w:w="1975"/>
-        <w:gridCol w:w="1880"/>
-        <w:gridCol w:w="1927"/>
-        <w:gridCol w:w="1928"/>
+        <w:gridCol w:w="1974"/>
+        <w:gridCol w:w="1881"/>
+        <w:gridCol w:w="1926"/>
+        <w:gridCol w:w="1929"/>
         <w:gridCol w:w="1928"/>
       </w:tblGrid>
       <w:tr>
         <w:trPr/>
         <w:tc>
           <w:tcPr>
-            <w:tcW w:w="1975" w:type="dxa"/>
+            <w:tcW w:w="1974" w:type="dxa"/>
             <w:tcBorders>
               <w:top w:val="single" w:sz="4" w:space="0" w:color="000000"/>
               <w:start w:val="single" w:sz="4" w:space="0" w:color="000000"/>
@@ -75,7 +75,7 @@
         </w:tc>
         <w:tc>
           <w:tcPr>
-            <w:tcW w:w="1880" w:type="dxa"/>
+            <w:tcW w:w="1881" w:type="dxa"/>
             <w:tcBorders>
               <w:top w:val="single" w:sz="4" w:space="0" w:color="000000"/>
               <w:start w:val="single" w:sz="4" w:space="0" w:color="000000"/>
@@ -124,7 +124,7 @@
         </w:tc>
         <w:tc>
           <w:tcPr>
-            <w:tcW w:w="1927" w:type="dxa"/>
+            <w:tcW w:w="1926" w:type="dxa"/>
             <w:tcBorders>
               <w:top w:val="single" w:sz="4" w:space="0" w:color="000000"/>
               <w:start w:val="single" w:sz="4" w:space="0" w:color="000000"/>
@@ -173,7 +173,7 @@
         </w:tc>
         <w:tc>
           <w:tcPr>
-            <w:tcW w:w="1928" w:type="dxa"/>
+            <w:tcW w:w="1929" w:type="dxa"/>
             <w:tcBorders>
               <w:top w:val="single" w:sz="4" w:space="0" w:color="000000"/>
               <w:start w:val="single" w:sz="4" w:space="0" w:color="000000"/>
@@ -275,7 +275,7 @@
         <w:trPr/>
         <w:tc>
           <w:tcPr>
-            <w:tcW w:w="1975" w:type="dxa"/>
+            <w:tcW w:w="1974" w:type="dxa"/>
             <w:tcBorders>
               <w:start w:val="single" w:sz="4" w:space="0" w:color="000000"/>
             </w:tcBorders>
@@ -295,7 +295,7 @@
         </w:tc>
         <w:tc>
           <w:tcPr>
-            <w:tcW w:w="1880" w:type="dxa"/>
+            <w:tcW w:w="1881" w:type="dxa"/>
             <w:tcBorders>
               <w:start w:val="single" w:sz="4" w:space="0" w:color="000000"/>
             </w:tcBorders>
@@ -315,7 +315,7 @@
         </w:tc>
         <w:tc>
           <w:tcPr>
-            <w:tcW w:w="1927" w:type="dxa"/>
+            <w:tcW w:w="1926" w:type="dxa"/>
             <w:tcBorders>
               <w:start w:val="single" w:sz="4" w:space="0" w:color="000000"/>
             </w:tcBorders>
@@ -335,25 +335,21 @@
         </w:tc>
         <w:tc>
           <w:tcPr>
-            <w:tcW w:w="1928" w:type="dxa"/>
-            <w:tcBorders>
-              <w:start w:val="single" w:sz="4" w:space="0" w:color="000000"/>
-            </w:tcBorders>
-          </w:tcPr>
-          <w:p>
-            <w:pPr>
-              <w:pStyle w:val="TableContents"/>
-              <w:bidi w:val="0"/>
-              <w:jc w:val="start"/>
-              <w:rPr/>
-            </w:pPr>
-            <w:r>
-              <w:rPr/>
-              <w:t xml:space="preserve">All POST fields + user_id </w:t>
-            </w:r>
-            <w:r>
-              <w:rPr/>
-              <w:t>in request body.</w:t>
+            <w:tcW w:w="1929" w:type="dxa"/>
+            <w:tcBorders>
+              <w:start w:val="single" w:sz="4" w:space="0" w:color="000000"/>
+            </w:tcBorders>
+          </w:tcPr>
+          <w:p>
+            <w:pPr>
+              <w:pStyle w:val="TableContents"/>
+              <w:bidi w:val="0"/>
+              <w:jc w:val="start"/>
+              <w:rPr/>
+            </w:pPr>
+            <w:r>
+              <w:rPr/>
+              <w:t>All POST fields + user_id in request body.</w:t>
             </w:r>
           </w:p>
         </w:tc>
@@ -383,7 +379,7 @@
         <w:trPr/>
         <w:tc>
           <w:tcPr>
-            <w:tcW w:w="1975" w:type="dxa"/>
+            <w:tcW w:w="1974" w:type="dxa"/>
             <w:tcBorders>
               <w:start w:val="single" w:sz="4" w:space="0" w:color="000000"/>
             </w:tcBorders>
@@ -399,31 +395,43 @@
               <w:rPr/>
               <w:t>updatePost</w:t>
             </w:r>
-          </w:p>
-        </w:tc>
-        <w:tc>
-          <w:tcPr>
-            <w:tcW w:w="1880" w:type="dxa"/>
-            <w:tcBorders>
-              <w:start w:val="single" w:sz="4" w:space="0" w:color="000000"/>
-            </w:tcBorders>
-          </w:tcPr>
-          <w:p>
-            <w:pPr>
-              <w:pStyle w:val="TableContents"/>
-              <w:bidi w:val="0"/>
-              <w:jc w:val="start"/>
-              <w:rPr/>
-            </w:pPr>
-            <w:r>
-              <w:rPr/>
-              <w:t>Update the post_title or post_content.</w:t>
-            </w:r>
-          </w:p>
-        </w:tc>
-        <w:tc>
-          <w:tcPr>
-            <w:tcW w:w="1927" w:type="dxa"/>
+            <w:r>
+              <w:rPr/>
+              <w:t>Title</w:t>
+            </w:r>
+          </w:p>
+        </w:tc>
+        <w:tc>
+          <w:tcPr>
+            <w:tcW w:w="1881" w:type="dxa"/>
+            <w:tcBorders>
+              <w:start w:val="single" w:sz="4" w:space="0" w:color="000000"/>
+            </w:tcBorders>
+          </w:tcPr>
+          <w:p>
+            <w:pPr>
+              <w:pStyle w:val="TableContents"/>
+              <w:bidi w:val="0"/>
+              <w:jc w:val="start"/>
+              <w:rPr/>
+            </w:pPr>
+            <w:r>
+              <w:rPr/>
+              <w:t xml:space="preserve">Update the </w:t>
+            </w:r>
+            <w:r>
+              <w:rPr/>
+              <w:t>post_title</w:t>
+            </w:r>
+            <w:r>
+              <w:rPr/>
+              <w:t>.</w:t>
+            </w:r>
+          </w:p>
+        </w:tc>
+        <w:tc>
+          <w:tcPr>
+            <w:tcW w:w="1926" w:type="dxa"/>
             <w:tcBorders>
               <w:start w:val="single" w:sz="4" w:space="0" w:color="000000"/>
             </w:tcBorders>
@@ -443,29 +451,29 @@
         </w:tc>
         <w:tc>
           <w:tcPr>
+            <w:tcW w:w="1929" w:type="dxa"/>
+            <w:tcBorders>
+              <w:start w:val="single" w:sz="4" w:space="0" w:color="000000"/>
+            </w:tcBorders>
+          </w:tcPr>
+          <w:p>
+            <w:pPr>
+              <w:pStyle w:val="TableContents"/>
+              <w:bidi w:val="0"/>
+              <w:jc w:val="start"/>
+              <w:rPr/>
+            </w:pPr>
+            <w:r>
+              <w:rPr/>
+              <w:t>post_title.</w:t>
+            </w:r>
+          </w:p>
+        </w:tc>
+        <w:tc>
+          <w:tcPr>
             <w:tcW w:w="1928" w:type="dxa"/>
             <w:tcBorders>
               <w:start w:val="single" w:sz="4" w:space="0" w:color="000000"/>
-            </w:tcBorders>
-          </w:tcPr>
-          <w:p>
-            <w:pPr>
-              <w:pStyle w:val="TableContents"/>
-              <w:bidi w:val="0"/>
-              <w:jc w:val="start"/>
-              <w:rPr/>
-            </w:pPr>
-            <w:r>
-              <w:rPr/>
-              <w:t>post_title, post_content or both fields in request body.</w:t>
-            </w:r>
-          </w:p>
-        </w:tc>
-        <w:tc>
-          <w:tcPr>
-            <w:tcW w:w="1928" w:type="dxa"/>
-            <w:tcBorders>
-              <w:start w:val="single" w:sz="4" w:space="0" w:color="000000"/>
               <w:end w:val="single" w:sz="4" w:space="0" w:color="000000"/>
             </w:tcBorders>
           </w:tcPr>
@@ -478,7 +486,7 @@
             </w:pPr>
             <w:r>
               <w:rPr/>
-              <w:t>Updated post_title and / or post_content for a given POST record.</w:t>
+              <w:t>Updated post_title for a given POST record.</w:t>
             </w:r>
           </w:p>
         </w:tc>
@@ -487,47 +495,59 @@
         <w:trPr/>
         <w:tc>
           <w:tcPr>
-            <w:tcW w:w="1975" w:type="dxa"/>
-            <w:tcBorders>
-              <w:start w:val="single" w:sz="4" w:space="0" w:color="000000"/>
-            </w:tcBorders>
-          </w:tcPr>
-          <w:p>
-            <w:pPr>
-              <w:pStyle w:val="TableContents"/>
-              <w:bidi w:val="0"/>
-              <w:jc w:val="start"/>
-              <w:rPr/>
-            </w:pPr>
-            <w:r>
-              <w:rPr/>
-              <w:t>updatePostStatus</w:t>
-            </w:r>
-          </w:p>
-        </w:tc>
-        <w:tc>
-          <w:tcPr>
-            <w:tcW w:w="1880" w:type="dxa"/>
-            <w:tcBorders>
-              <w:start w:val="single" w:sz="4" w:space="0" w:color="000000"/>
-            </w:tcBorders>
-          </w:tcPr>
-          <w:p>
-            <w:pPr>
-              <w:pStyle w:val="TableContents"/>
-              <w:bidi w:val="0"/>
-              <w:jc w:val="start"/>
-              <w:rPr/>
-            </w:pPr>
-            <w:r>
-              <w:rPr/>
-              <w:t>Update the post_status.</w:t>
-            </w:r>
-          </w:p>
-        </w:tc>
-        <w:tc>
-          <w:tcPr>
-            <w:tcW w:w="1927" w:type="dxa"/>
+            <w:tcW w:w="1974" w:type="dxa"/>
+            <w:tcBorders>
+              <w:start w:val="single" w:sz="4" w:space="0" w:color="000000"/>
+            </w:tcBorders>
+          </w:tcPr>
+          <w:p>
+            <w:pPr>
+              <w:pStyle w:val="TableContents"/>
+              <w:bidi w:val="0"/>
+              <w:jc w:val="start"/>
+              <w:rPr/>
+            </w:pPr>
+            <w:r>
+              <w:rPr/>
+              <w:t>updatePost</w:t>
+            </w:r>
+            <w:r>
+              <w:rPr/>
+              <w:t>Content</w:t>
+            </w:r>
+          </w:p>
+        </w:tc>
+        <w:tc>
+          <w:tcPr>
+            <w:tcW w:w="1881" w:type="dxa"/>
+            <w:tcBorders>
+              <w:start w:val="single" w:sz="4" w:space="0" w:color="000000"/>
+            </w:tcBorders>
+          </w:tcPr>
+          <w:p>
+            <w:pPr>
+              <w:pStyle w:val="TableContents"/>
+              <w:bidi w:val="0"/>
+              <w:jc w:val="start"/>
+              <w:rPr/>
+            </w:pPr>
+            <w:r>
+              <w:rPr/>
+              <w:t xml:space="preserve">Update the </w:t>
+            </w:r>
+            <w:r>
+              <w:rPr/>
+              <w:t>post_content</w:t>
+            </w:r>
+            <w:r>
+              <w:rPr/>
+              <w:t>.</w:t>
+            </w:r>
+          </w:p>
+        </w:tc>
+        <w:tc>
+          <w:tcPr>
+            <w:tcW w:w="1926" w:type="dxa"/>
             <w:tcBorders>
               <w:start w:val="single" w:sz="4" w:space="0" w:color="000000"/>
             </w:tcBorders>
@@ -547,29 +567,37 @@
         </w:tc>
         <w:tc>
           <w:tcPr>
+            <w:tcW w:w="1929" w:type="dxa"/>
+            <w:tcBorders>
+              <w:start w:val="single" w:sz="4" w:space="0" w:color="000000"/>
+            </w:tcBorders>
+          </w:tcPr>
+          <w:p>
+            <w:pPr>
+              <w:pStyle w:val="TableContents"/>
+              <w:bidi w:val="0"/>
+              <w:jc w:val="start"/>
+              <w:rPr/>
+            </w:pPr>
+            <w:r>
+              <w:rPr/>
+              <w:t>post_</w:t>
+            </w:r>
+            <w:r>
+              <w:rPr/>
+              <w:t>content</w:t>
+            </w:r>
+            <w:r>
+              <w:rPr/>
+              <w:t>.</w:t>
+            </w:r>
+          </w:p>
+        </w:tc>
+        <w:tc>
+          <w:tcPr>
             <w:tcW w:w="1928" w:type="dxa"/>
             <w:tcBorders>
               <w:start w:val="single" w:sz="4" w:space="0" w:color="000000"/>
-            </w:tcBorders>
-          </w:tcPr>
-          <w:p>
-            <w:pPr>
-              <w:pStyle w:val="TableContents"/>
-              <w:bidi w:val="0"/>
-              <w:jc w:val="start"/>
-              <w:rPr/>
-            </w:pPr>
-            <w:r>
-              <w:rPr/>
-              <w:t>post_status in request body.</w:t>
-            </w:r>
-          </w:p>
-        </w:tc>
-        <w:tc>
-          <w:tcPr>
-            <w:tcW w:w="1928" w:type="dxa"/>
-            <w:tcBorders>
-              <w:start w:val="single" w:sz="4" w:space="0" w:color="000000"/>
               <w:end w:val="single" w:sz="4" w:space="0" w:color="000000"/>
             </w:tcBorders>
           </w:tcPr>
@@ -582,7 +610,15 @@
             </w:pPr>
             <w:r>
               <w:rPr/>
-              <w:t>Updated post_status for a given POST record.</w:t>
+              <w:t>Updated post_</w:t>
+            </w:r>
+            <w:r>
+              <w:rPr/>
+              <w:t>content</w:t>
+            </w:r>
+            <w:r>
+              <w:rPr/>
+              <w:t xml:space="preserve"> for a given POST record.</w:t>
             </w:r>
           </w:p>
         </w:tc>
@@ -591,47 +627,47 @@
         <w:trPr/>
         <w:tc>
           <w:tcPr>
-            <w:tcW w:w="1975" w:type="dxa"/>
-            <w:tcBorders>
-              <w:start w:val="single" w:sz="4" w:space="0" w:color="000000"/>
-            </w:tcBorders>
-          </w:tcPr>
-          <w:p>
-            <w:pPr>
-              <w:pStyle w:val="TableContents"/>
-              <w:bidi w:val="0"/>
-              <w:jc w:val="start"/>
-              <w:rPr/>
-            </w:pPr>
-            <w:r>
-              <w:rPr/>
-              <w:t>findOnePost</w:t>
-            </w:r>
-          </w:p>
-        </w:tc>
-        <w:tc>
-          <w:tcPr>
-            <w:tcW w:w="1880" w:type="dxa"/>
-            <w:tcBorders>
-              <w:start w:val="single" w:sz="4" w:space="0" w:color="000000"/>
-            </w:tcBorders>
-          </w:tcPr>
-          <w:p>
-            <w:pPr>
-              <w:pStyle w:val="TableContents"/>
-              <w:bidi w:val="0"/>
-              <w:jc w:val="start"/>
-              <w:rPr/>
-            </w:pPr>
-            <w:r>
-              <w:rPr/>
-              <w:t>Find a given POST using the post_id.</w:t>
-            </w:r>
-          </w:p>
-        </w:tc>
-        <w:tc>
-          <w:tcPr>
-            <w:tcW w:w="1927" w:type="dxa"/>
+            <w:tcW w:w="1974" w:type="dxa"/>
+            <w:tcBorders>
+              <w:start w:val="single" w:sz="4" w:space="0" w:color="000000"/>
+            </w:tcBorders>
+          </w:tcPr>
+          <w:p>
+            <w:pPr>
+              <w:pStyle w:val="TableContents"/>
+              <w:bidi w:val="0"/>
+              <w:jc w:val="start"/>
+              <w:rPr/>
+            </w:pPr>
+            <w:r>
+              <w:rPr/>
+              <w:t>updatePostStatus</w:t>
+            </w:r>
+          </w:p>
+        </w:tc>
+        <w:tc>
+          <w:tcPr>
+            <w:tcW w:w="1881" w:type="dxa"/>
+            <w:tcBorders>
+              <w:start w:val="single" w:sz="4" w:space="0" w:color="000000"/>
+            </w:tcBorders>
+          </w:tcPr>
+          <w:p>
+            <w:pPr>
+              <w:pStyle w:val="TableContents"/>
+              <w:bidi w:val="0"/>
+              <w:jc w:val="start"/>
+              <w:rPr/>
+            </w:pPr>
+            <w:r>
+              <w:rPr/>
+              <w:t>Update the post_status.</w:t>
+            </w:r>
+          </w:p>
+        </w:tc>
+        <w:tc>
+          <w:tcPr>
+            <w:tcW w:w="1926" w:type="dxa"/>
             <w:tcBorders>
               <w:start w:val="single" w:sz="4" w:space="0" w:color="000000"/>
             </w:tcBorders>
@@ -651,29 +687,29 @@
         </w:tc>
         <w:tc>
           <w:tcPr>
+            <w:tcW w:w="1929" w:type="dxa"/>
+            <w:tcBorders>
+              <w:start w:val="single" w:sz="4" w:space="0" w:color="000000"/>
+            </w:tcBorders>
+          </w:tcPr>
+          <w:p>
+            <w:pPr>
+              <w:pStyle w:val="TableContents"/>
+              <w:bidi w:val="0"/>
+              <w:jc w:val="start"/>
+              <w:rPr/>
+            </w:pPr>
+            <w:r>
+              <w:rPr/>
+              <w:t>post_status in request body.</w:t>
+            </w:r>
+          </w:p>
+        </w:tc>
+        <w:tc>
+          <w:tcPr>
             <w:tcW w:w="1928" w:type="dxa"/>
             <w:tcBorders>
               <w:start w:val="single" w:sz="4" w:space="0" w:color="000000"/>
-            </w:tcBorders>
-          </w:tcPr>
-          <w:p>
-            <w:pPr>
-              <w:pStyle w:val="TableContents"/>
-              <w:bidi w:val="0"/>
-              <w:jc w:val="start"/>
-              <w:rPr/>
-            </w:pPr>
-            <w:r>
-              <w:rPr/>
-              <w:t>post_id in URL param.</w:t>
-            </w:r>
-          </w:p>
-        </w:tc>
-        <w:tc>
-          <w:tcPr>
-            <w:tcW w:w="1928" w:type="dxa"/>
-            <w:tcBorders>
-              <w:start w:val="single" w:sz="4" w:space="0" w:color="000000"/>
               <w:end w:val="single" w:sz="4" w:space="0" w:color="000000"/>
             </w:tcBorders>
           </w:tcPr>
@@ -686,7 +722,7 @@
             </w:pPr>
             <w:r>
               <w:rPr/>
-              <w:t>POST record.</w:t>
+              <w:t>Updated post_status for a given POST record.</w:t>
             </w:r>
           </w:p>
         </w:tc>
@@ -695,47 +731,47 @@
         <w:trPr/>
         <w:tc>
           <w:tcPr>
-            <w:tcW w:w="1975" w:type="dxa"/>
-            <w:tcBorders>
-              <w:start w:val="single" w:sz="4" w:space="0" w:color="000000"/>
-            </w:tcBorders>
-          </w:tcPr>
-          <w:p>
-            <w:pPr>
-              <w:pStyle w:val="TableContents"/>
-              <w:bidi w:val="0"/>
-              <w:jc w:val="start"/>
-              <w:rPr/>
-            </w:pPr>
-            <w:r>
-              <w:rPr/>
-              <w:t>searchPostsByTitle</w:t>
-            </w:r>
-          </w:p>
-        </w:tc>
-        <w:tc>
-          <w:tcPr>
-            <w:tcW w:w="1880" w:type="dxa"/>
-            <w:tcBorders>
-              <w:start w:val="single" w:sz="4" w:space="0" w:color="000000"/>
-            </w:tcBorders>
-          </w:tcPr>
-          <w:p>
-            <w:pPr>
-              <w:pStyle w:val="TableContents"/>
-              <w:bidi w:val="0"/>
-              <w:jc w:val="start"/>
-              <w:rPr/>
-            </w:pPr>
-            <w:r>
-              <w:rPr/>
-              <w:t>Find a given POST using the post_title</w:t>
-            </w:r>
-          </w:p>
-        </w:tc>
-        <w:tc>
-          <w:tcPr>
-            <w:tcW w:w="1927" w:type="dxa"/>
+            <w:tcW w:w="1974" w:type="dxa"/>
+            <w:tcBorders>
+              <w:start w:val="single" w:sz="4" w:space="0" w:color="000000"/>
+            </w:tcBorders>
+          </w:tcPr>
+          <w:p>
+            <w:pPr>
+              <w:pStyle w:val="TableContents"/>
+              <w:bidi w:val="0"/>
+              <w:jc w:val="start"/>
+              <w:rPr/>
+            </w:pPr>
+            <w:r>
+              <w:rPr/>
+              <w:t>findOnePost</w:t>
+            </w:r>
+          </w:p>
+        </w:tc>
+        <w:tc>
+          <w:tcPr>
+            <w:tcW w:w="1881" w:type="dxa"/>
+            <w:tcBorders>
+              <w:start w:val="single" w:sz="4" w:space="0" w:color="000000"/>
+            </w:tcBorders>
+          </w:tcPr>
+          <w:p>
+            <w:pPr>
+              <w:pStyle w:val="TableContents"/>
+              <w:bidi w:val="0"/>
+              <w:jc w:val="start"/>
+              <w:rPr/>
+            </w:pPr>
+            <w:r>
+              <w:rPr/>
+              <w:t>Find a given POST using the post_id.</w:t>
+            </w:r>
+          </w:p>
+        </w:tc>
+        <w:tc>
+          <w:tcPr>
+            <w:tcW w:w="1926" w:type="dxa"/>
             <w:tcBorders>
               <w:start w:val="single" w:sz="4" w:space="0" w:color="000000"/>
             </w:tcBorders>
@@ -755,29 +791,29 @@
         </w:tc>
         <w:tc>
           <w:tcPr>
+            <w:tcW w:w="1929" w:type="dxa"/>
+            <w:tcBorders>
+              <w:start w:val="single" w:sz="4" w:space="0" w:color="000000"/>
+            </w:tcBorders>
+          </w:tcPr>
+          <w:p>
+            <w:pPr>
+              <w:pStyle w:val="TableContents"/>
+              <w:bidi w:val="0"/>
+              <w:jc w:val="start"/>
+              <w:rPr/>
+            </w:pPr>
+            <w:r>
+              <w:rPr/>
+              <w:t>post_id in URL param.</w:t>
+            </w:r>
+          </w:p>
+        </w:tc>
+        <w:tc>
+          <w:tcPr>
             <w:tcW w:w="1928" w:type="dxa"/>
             <w:tcBorders>
               <w:start w:val="single" w:sz="4" w:space="0" w:color="000000"/>
-            </w:tcBorders>
-          </w:tcPr>
-          <w:p>
-            <w:pPr>
-              <w:pStyle w:val="TableContents"/>
-              <w:bidi w:val="0"/>
-              <w:jc w:val="start"/>
-              <w:rPr/>
-            </w:pPr>
-            <w:r>
-              <w:rPr/>
-              <w:t>post_title in request body.</w:t>
-            </w:r>
-          </w:p>
-        </w:tc>
-        <w:tc>
-          <w:tcPr>
-            <w:tcW w:w="1928" w:type="dxa"/>
-            <w:tcBorders>
-              <w:start w:val="single" w:sz="4" w:space="0" w:color="000000"/>
               <w:end w:val="single" w:sz="4" w:space="0" w:color="000000"/>
             </w:tcBorders>
           </w:tcPr>
@@ -790,7 +826,7 @@
             </w:pPr>
             <w:r>
               <w:rPr/>
-              <w:t>POST records.</w:t>
+              <w:t>POST record.</w:t>
             </w:r>
           </w:p>
         </w:tc>
@@ -799,7 +835,111 @@
         <w:trPr/>
         <w:tc>
           <w:tcPr>
-            <w:tcW w:w="1975" w:type="dxa"/>
+            <w:tcW w:w="1974" w:type="dxa"/>
+            <w:tcBorders>
+              <w:start w:val="single" w:sz="4" w:space="0" w:color="000000"/>
+            </w:tcBorders>
+          </w:tcPr>
+          <w:p>
+            <w:pPr>
+              <w:pStyle w:val="TableContents"/>
+              <w:bidi w:val="0"/>
+              <w:jc w:val="start"/>
+              <w:rPr/>
+            </w:pPr>
+            <w:r>
+              <w:rPr/>
+              <w:t>searchPostsByTitle</w:t>
+            </w:r>
+          </w:p>
+        </w:tc>
+        <w:tc>
+          <w:tcPr>
+            <w:tcW w:w="1881" w:type="dxa"/>
+            <w:tcBorders>
+              <w:start w:val="single" w:sz="4" w:space="0" w:color="000000"/>
+            </w:tcBorders>
+          </w:tcPr>
+          <w:p>
+            <w:pPr>
+              <w:pStyle w:val="TableContents"/>
+              <w:bidi w:val="0"/>
+              <w:jc w:val="start"/>
+              <w:rPr/>
+            </w:pPr>
+            <w:r>
+              <w:rPr/>
+              <w:t>Find a given POST using the post_title</w:t>
+            </w:r>
+          </w:p>
+        </w:tc>
+        <w:tc>
+          <w:tcPr>
+            <w:tcW w:w="1926" w:type="dxa"/>
+            <w:tcBorders>
+              <w:start w:val="single" w:sz="4" w:space="0" w:color="000000"/>
+            </w:tcBorders>
+          </w:tcPr>
+          <w:p>
+            <w:pPr>
+              <w:pStyle w:val="TableContents"/>
+              <w:bidi w:val="0"/>
+              <w:jc w:val="start"/>
+              <w:rPr/>
+            </w:pPr>
+            <w:r>
+              <w:rPr/>
+              <w:t>None</w:t>
+            </w:r>
+          </w:p>
+        </w:tc>
+        <w:tc>
+          <w:tcPr>
+            <w:tcW w:w="1929" w:type="dxa"/>
+            <w:tcBorders>
+              <w:start w:val="single" w:sz="4" w:space="0" w:color="000000"/>
+            </w:tcBorders>
+          </w:tcPr>
+          <w:p>
+            <w:pPr>
+              <w:pStyle w:val="TableContents"/>
+              <w:bidi w:val="0"/>
+              <w:jc w:val="start"/>
+              <w:rPr/>
+            </w:pPr>
+            <w:r>
+              <w:rPr/>
+              <w:t>post_title in request body.</w:t>
+            </w:r>
+          </w:p>
+        </w:tc>
+        <w:tc>
+          <w:tcPr>
+            <w:tcW w:w="1928" w:type="dxa"/>
+            <w:tcBorders>
+              <w:start w:val="single" w:sz="4" w:space="0" w:color="000000"/>
+              <w:end w:val="single" w:sz="4" w:space="0" w:color="000000"/>
+            </w:tcBorders>
+          </w:tcPr>
+          <w:p>
+            <w:pPr>
+              <w:pStyle w:val="TableContents"/>
+              <w:bidi w:val="0"/>
+              <w:jc w:val="start"/>
+              <w:rPr/>
+            </w:pPr>
+            <w:r>
+              <w:rPr/>
+              <w:t>POST records.</w:t>
+            </w:r>
+          </w:p>
+        </w:tc>
+      </w:tr>
+      <w:tr>
+        <w:trPr/>
+        <w:tc>
+          <w:tcPr>
+            <w:tcW w:w="1974" w:type="dxa"/>
             <w:tcBorders>
               <w:start w:val="single" w:sz="4" w:space="0" w:color="000000"/>
               <w:bottom w:val="single" w:sz="4" w:space="0" w:color="000000"/>
@@ -820,7 +960,7 @@
         </w:tc>
         <w:tc>
           <w:tcPr>
-            <w:tcW w:w="1880" w:type="dxa"/>
+            <w:tcW w:w="1881" w:type="dxa"/>
             <w:tcBorders>
               <w:start w:val="single" w:sz="4" w:space="0" w:color="000000"/>
               <w:bottom w:val="single" w:sz="4" w:space="0" w:color="000000"/>
@@ -841,7 +981,7 @@
         </w:tc>
         <w:tc>
           <w:tcPr>
-            <w:tcW w:w="1927" w:type="dxa"/>
+            <w:tcW w:w="1926" w:type="dxa"/>
             <w:tcBorders>
               <w:start w:val="single" w:sz="4" w:space="0" w:color="000000"/>
               <w:bottom w:val="single" w:sz="4" w:space="0" w:color="000000"/>
@@ -862,7 +1002,7 @@
         </w:tc>
         <w:tc>
           <w:tcPr>
-            <w:tcW w:w="1928" w:type="dxa"/>
+            <w:tcW w:w="1929" w:type="dxa"/>
             <w:tcBorders>
               <w:start w:val="single" w:sz="4" w:space="0" w:color="000000"/>
               <w:bottom w:val="single" w:sz="4" w:space="0" w:color="000000"/>
@@ -923,6 +1063,7 @@
       <w:pgNumType w:fmt="decimal"/>
       <w:formProt w:val="false"/>
       <w:textDirection w:val="lrTb"/>
+      <w:docGrid w:type="default" w:linePitch="100" w:charSpace="0"/>
     </w:sectPr>
   </w:body>
 </w:document>
@@ -942,7 +1083,6 @@
     </w:rPrDefault>
     <w:pPrDefault>
       <w:pPr>
-        <w:widowControl/>
         <w:suppressAutoHyphens w:val="true"/>
       </w:pPr>
     </w:pPrDefault>
@@ -952,7 +1092,10 @@
     <w:qFormat/>
     <w:pPr>
       <w:widowControl/>
+      <w:suppressAutoHyphens w:val="true"/>
       <w:bidi w:val="0"/>
+      <w:spacing w:before="0" w:after="0"/>
+      <w:jc w:val="start"/>
     </w:pPr>
     <w:rPr>
       <w:rFonts w:ascii="Liberation Serif" w:hAnsi="Liberation Serif" w:eastAsia="Noto Serif CJK SC" w:cs="Noto Sans Devanagari"/>
@@ -1030,6 +1173,19 @@
       <w:suppressLineNumbers/>
     </w:pPr>
     <w:rPr/>
+  </w:style>
+  <w:style w:type="paragraph" w:styleId="TableHeading">
+    <w:name w:val="Table Heading"/>
+    <w:basedOn w:val="TableContents"/>
+    <w:qFormat/>
+    <w:pPr>
+      <w:suppressLineNumbers/>
+      <w:jc w:val="center"/>
+    </w:pPr>
+    <w:rPr>
+      <w:b/>
+      <w:bCs/>
+    </w:rPr>
   </w:style>
 </w:styles>
 </file>

</xml_diff>

<commit_message>
Added criteria for post integration tests in POST_APIs.focx.
</commit_message>
<xml_diff>
--- a/Portal_Database_Design/Post_APIs.docx
+++ b/Portal_Database_Design/Post_APIs.docx
@@ -16,17 +16,17 @@
         </w:tblCellMar>
       </w:tblPr>
       <w:tblGrid>
-        <w:gridCol w:w="1974"/>
-        <w:gridCol w:w="1881"/>
-        <w:gridCol w:w="1926"/>
-        <w:gridCol w:w="1929"/>
+        <w:gridCol w:w="1972"/>
+        <w:gridCol w:w="1883"/>
+        <w:gridCol w:w="1924"/>
+        <w:gridCol w:w="1931"/>
         <w:gridCol w:w="1928"/>
       </w:tblGrid>
       <w:tr>
         <w:trPr/>
         <w:tc>
           <w:tcPr>
-            <w:tcW w:w="1974" w:type="dxa"/>
+            <w:tcW w:w="1972" w:type="dxa"/>
             <w:tcBorders>
               <w:top w:val="single" w:sz="4" w:space="0" w:color="000000"/>
               <w:start w:val="single" w:sz="4" w:space="0" w:color="000000"/>
@@ -75,7 +75,7 @@
         </w:tc>
         <w:tc>
           <w:tcPr>
-            <w:tcW w:w="1881" w:type="dxa"/>
+            <w:tcW w:w="1883" w:type="dxa"/>
             <w:tcBorders>
               <w:top w:val="single" w:sz="4" w:space="0" w:color="000000"/>
               <w:start w:val="single" w:sz="4" w:space="0" w:color="000000"/>
@@ -124,7 +124,7 @@
         </w:tc>
         <w:tc>
           <w:tcPr>
-            <w:tcW w:w="1926" w:type="dxa"/>
+            <w:tcW w:w="1924" w:type="dxa"/>
             <w:tcBorders>
               <w:top w:val="single" w:sz="4" w:space="0" w:color="000000"/>
               <w:start w:val="single" w:sz="4" w:space="0" w:color="000000"/>
@@ -173,7 +173,7 @@
         </w:tc>
         <w:tc>
           <w:tcPr>
-            <w:tcW w:w="1929" w:type="dxa"/>
+            <w:tcW w:w="1931" w:type="dxa"/>
             <w:tcBorders>
               <w:top w:val="single" w:sz="4" w:space="0" w:color="000000"/>
               <w:start w:val="single" w:sz="4" w:space="0" w:color="000000"/>
@@ -275,7 +275,7 @@
         <w:trPr/>
         <w:tc>
           <w:tcPr>
-            <w:tcW w:w="1974" w:type="dxa"/>
+            <w:tcW w:w="1972" w:type="dxa"/>
             <w:tcBorders>
               <w:start w:val="single" w:sz="4" w:space="0" w:color="000000"/>
             </w:tcBorders>
@@ -295,7 +295,7 @@
         </w:tc>
         <w:tc>
           <w:tcPr>
-            <w:tcW w:w="1881" w:type="dxa"/>
+            <w:tcW w:w="1883" w:type="dxa"/>
             <w:tcBorders>
               <w:start w:val="single" w:sz="4" w:space="0" w:color="000000"/>
             </w:tcBorders>
@@ -315,7 +315,7 @@
         </w:tc>
         <w:tc>
           <w:tcPr>
-            <w:tcW w:w="1926" w:type="dxa"/>
+            <w:tcW w:w="1924" w:type="dxa"/>
             <w:tcBorders>
               <w:start w:val="single" w:sz="4" w:space="0" w:color="000000"/>
             </w:tcBorders>
@@ -335,7 +335,7 @@
         </w:tc>
         <w:tc>
           <w:tcPr>
-            <w:tcW w:w="1929" w:type="dxa"/>
+            <w:tcW w:w="1931" w:type="dxa"/>
             <w:tcBorders>
               <w:start w:val="single" w:sz="4" w:space="0" w:color="000000"/>
             </w:tcBorders>
@@ -379,59 +379,47 @@
         <w:trPr/>
         <w:tc>
           <w:tcPr>
-            <w:tcW w:w="1974" w:type="dxa"/>
-            <w:tcBorders>
-              <w:start w:val="single" w:sz="4" w:space="0" w:color="000000"/>
-            </w:tcBorders>
-          </w:tcPr>
-          <w:p>
-            <w:pPr>
-              <w:pStyle w:val="TableContents"/>
-              <w:bidi w:val="0"/>
-              <w:jc w:val="start"/>
-              <w:rPr/>
-            </w:pPr>
-            <w:r>
-              <w:rPr/>
-              <w:t>updatePost</w:t>
-            </w:r>
-            <w:r>
-              <w:rPr/>
-              <w:t>Title</w:t>
-            </w:r>
-          </w:p>
-        </w:tc>
-        <w:tc>
-          <w:tcPr>
-            <w:tcW w:w="1881" w:type="dxa"/>
-            <w:tcBorders>
-              <w:start w:val="single" w:sz="4" w:space="0" w:color="000000"/>
-            </w:tcBorders>
-          </w:tcPr>
-          <w:p>
-            <w:pPr>
-              <w:pStyle w:val="TableContents"/>
-              <w:bidi w:val="0"/>
-              <w:jc w:val="start"/>
-              <w:rPr/>
-            </w:pPr>
-            <w:r>
-              <w:rPr/>
-              <w:t xml:space="preserve">Update the </w:t>
-            </w:r>
-            <w:r>
-              <w:rPr/>
-              <w:t>post_title</w:t>
-            </w:r>
-            <w:r>
-              <w:rPr/>
-              <w:t>.</w:t>
-            </w:r>
-          </w:p>
-        </w:tc>
-        <w:tc>
-          <w:tcPr>
-            <w:tcW w:w="1926" w:type="dxa"/>
+            <w:tcW w:w="1972" w:type="dxa"/>
+            <w:tcBorders>
+              <w:start w:val="single" w:sz="4" w:space="0" w:color="000000"/>
+            </w:tcBorders>
+          </w:tcPr>
+          <w:p>
+            <w:pPr>
+              <w:pStyle w:val="TableContents"/>
+              <w:bidi w:val="0"/>
+              <w:jc w:val="start"/>
+              <w:rPr/>
+            </w:pPr>
+            <w:r>
+              <w:rPr/>
+              <w:t>updatePostTitle</w:t>
+            </w:r>
+          </w:p>
+        </w:tc>
+        <w:tc>
+          <w:tcPr>
+            <w:tcW w:w="1883" w:type="dxa"/>
+            <w:tcBorders>
+              <w:start w:val="single" w:sz="4" w:space="0" w:color="000000"/>
+            </w:tcBorders>
+          </w:tcPr>
+          <w:p>
+            <w:pPr>
+              <w:pStyle w:val="TableContents"/>
+              <w:bidi w:val="0"/>
+              <w:jc w:val="start"/>
+              <w:rPr/>
+            </w:pPr>
+            <w:r>
+              <w:rPr/>
+              <w:t>Update the post_title.</w:t>
+            </w:r>
+          </w:p>
+        </w:tc>
+        <w:tc>
+          <w:tcPr>
+            <w:tcW w:w="1924" w:type="dxa"/>
             <w:tcBorders>
               <w:start w:val="single" w:sz="4" w:space="0" w:color="000000"/>
             </w:tcBorders>
@@ -451,7 +439,7 @@
         </w:tc>
         <w:tc>
           <w:tcPr>
-            <w:tcW w:w="1929" w:type="dxa"/>
+            <w:tcW w:w="1931" w:type="dxa"/>
             <w:tcBorders>
               <w:start w:val="single" w:sz="4" w:space="0" w:color="000000"/>
             </w:tcBorders>
@@ -495,59 +483,47 @@
         <w:trPr/>
         <w:tc>
           <w:tcPr>
-            <w:tcW w:w="1974" w:type="dxa"/>
-            <w:tcBorders>
-              <w:start w:val="single" w:sz="4" w:space="0" w:color="000000"/>
-            </w:tcBorders>
-          </w:tcPr>
-          <w:p>
-            <w:pPr>
-              <w:pStyle w:val="TableContents"/>
-              <w:bidi w:val="0"/>
-              <w:jc w:val="start"/>
-              <w:rPr/>
-            </w:pPr>
-            <w:r>
-              <w:rPr/>
-              <w:t>updatePost</w:t>
-            </w:r>
-            <w:r>
-              <w:rPr/>
-              <w:t>Content</w:t>
-            </w:r>
-          </w:p>
-        </w:tc>
-        <w:tc>
-          <w:tcPr>
-            <w:tcW w:w="1881" w:type="dxa"/>
-            <w:tcBorders>
-              <w:start w:val="single" w:sz="4" w:space="0" w:color="000000"/>
-            </w:tcBorders>
-          </w:tcPr>
-          <w:p>
-            <w:pPr>
-              <w:pStyle w:val="TableContents"/>
-              <w:bidi w:val="0"/>
-              <w:jc w:val="start"/>
-              <w:rPr/>
-            </w:pPr>
-            <w:r>
-              <w:rPr/>
-              <w:t xml:space="preserve">Update the </w:t>
-            </w:r>
-            <w:r>
-              <w:rPr/>
-              <w:t>post_content</w:t>
-            </w:r>
-            <w:r>
-              <w:rPr/>
-              <w:t>.</w:t>
-            </w:r>
-          </w:p>
-        </w:tc>
-        <w:tc>
-          <w:tcPr>
-            <w:tcW w:w="1926" w:type="dxa"/>
+            <w:tcW w:w="1972" w:type="dxa"/>
+            <w:tcBorders>
+              <w:start w:val="single" w:sz="4" w:space="0" w:color="000000"/>
+            </w:tcBorders>
+          </w:tcPr>
+          <w:p>
+            <w:pPr>
+              <w:pStyle w:val="TableContents"/>
+              <w:bidi w:val="0"/>
+              <w:jc w:val="start"/>
+              <w:rPr/>
+            </w:pPr>
+            <w:r>
+              <w:rPr/>
+              <w:t>updatePostContent</w:t>
+            </w:r>
+          </w:p>
+        </w:tc>
+        <w:tc>
+          <w:tcPr>
+            <w:tcW w:w="1883" w:type="dxa"/>
+            <w:tcBorders>
+              <w:start w:val="single" w:sz="4" w:space="0" w:color="000000"/>
+            </w:tcBorders>
+          </w:tcPr>
+          <w:p>
+            <w:pPr>
+              <w:pStyle w:val="TableContents"/>
+              <w:bidi w:val="0"/>
+              <w:jc w:val="start"/>
+              <w:rPr/>
+            </w:pPr>
+            <w:r>
+              <w:rPr/>
+              <w:t>Update the post_content.</w:t>
+            </w:r>
+          </w:p>
+        </w:tc>
+        <w:tc>
+          <w:tcPr>
+            <w:tcW w:w="1924" w:type="dxa"/>
             <w:tcBorders>
               <w:start w:val="single" w:sz="4" w:space="0" w:color="000000"/>
             </w:tcBorders>
@@ -567,29 +543,21 @@
         </w:tc>
         <w:tc>
           <w:tcPr>
-            <w:tcW w:w="1929" w:type="dxa"/>
-            <w:tcBorders>
-              <w:start w:val="single" w:sz="4" w:space="0" w:color="000000"/>
-            </w:tcBorders>
-          </w:tcPr>
-          <w:p>
-            <w:pPr>
-              <w:pStyle w:val="TableContents"/>
-              <w:bidi w:val="0"/>
-              <w:jc w:val="start"/>
-              <w:rPr/>
-            </w:pPr>
-            <w:r>
-              <w:rPr/>
-              <w:t>post_</w:t>
-            </w:r>
-            <w:r>
-              <w:rPr/>
-              <w:t>content</w:t>
-            </w:r>
-            <w:r>
-              <w:rPr/>
-              <w:t>.</w:t>
+            <w:tcW w:w="1931" w:type="dxa"/>
+            <w:tcBorders>
+              <w:start w:val="single" w:sz="4" w:space="0" w:color="000000"/>
+            </w:tcBorders>
+          </w:tcPr>
+          <w:p>
+            <w:pPr>
+              <w:pStyle w:val="TableContents"/>
+              <w:bidi w:val="0"/>
+              <w:jc w:val="start"/>
+              <w:rPr/>
+            </w:pPr>
+            <w:r>
+              <w:rPr/>
+              <w:t>post_content.</w:t>
             </w:r>
           </w:p>
         </w:tc>
@@ -610,15 +578,7 @@
             </w:pPr>
             <w:r>
               <w:rPr/>
-              <w:t>Updated post_</w:t>
-            </w:r>
-            <w:r>
-              <w:rPr/>
-              <w:t>content</w:t>
-            </w:r>
-            <w:r>
-              <w:rPr/>
-              <w:t xml:space="preserve"> for a given POST record.</w:t>
+              <w:t>Updated post_content for a given POST record.</w:t>
             </w:r>
           </w:p>
         </w:tc>
@@ -627,7 +587,7 @@
         <w:trPr/>
         <w:tc>
           <w:tcPr>
-            <w:tcW w:w="1974" w:type="dxa"/>
+            <w:tcW w:w="1972" w:type="dxa"/>
             <w:tcBorders>
               <w:start w:val="single" w:sz="4" w:space="0" w:color="000000"/>
             </w:tcBorders>
@@ -647,7 +607,7 @@
         </w:tc>
         <w:tc>
           <w:tcPr>
-            <w:tcW w:w="1881" w:type="dxa"/>
+            <w:tcW w:w="1883" w:type="dxa"/>
             <w:tcBorders>
               <w:start w:val="single" w:sz="4" w:space="0" w:color="000000"/>
             </w:tcBorders>
@@ -667,7 +627,7 @@
         </w:tc>
         <w:tc>
           <w:tcPr>
-            <w:tcW w:w="1926" w:type="dxa"/>
+            <w:tcW w:w="1924" w:type="dxa"/>
             <w:tcBorders>
               <w:start w:val="single" w:sz="4" w:space="0" w:color="000000"/>
             </w:tcBorders>
@@ -687,7 +647,7 @@
         </w:tc>
         <w:tc>
           <w:tcPr>
-            <w:tcW w:w="1929" w:type="dxa"/>
+            <w:tcW w:w="1931" w:type="dxa"/>
             <w:tcBorders>
               <w:start w:val="single" w:sz="4" w:space="0" w:color="000000"/>
             </w:tcBorders>
@@ -731,7 +691,7 @@
         <w:trPr/>
         <w:tc>
           <w:tcPr>
-            <w:tcW w:w="1974" w:type="dxa"/>
+            <w:tcW w:w="1972" w:type="dxa"/>
             <w:tcBorders>
               <w:start w:val="single" w:sz="4" w:space="0" w:color="000000"/>
             </w:tcBorders>
@@ -751,7 +711,7 @@
         </w:tc>
         <w:tc>
           <w:tcPr>
-            <w:tcW w:w="1881" w:type="dxa"/>
+            <w:tcW w:w="1883" w:type="dxa"/>
             <w:tcBorders>
               <w:start w:val="single" w:sz="4" w:space="0" w:color="000000"/>
             </w:tcBorders>
@@ -771,7 +731,7 @@
         </w:tc>
         <w:tc>
           <w:tcPr>
-            <w:tcW w:w="1926" w:type="dxa"/>
+            <w:tcW w:w="1924" w:type="dxa"/>
             <w:tcBorders>
               <w:start w:val="single" w:sz="4" w:space="0" w:color="000000"/>
             </w:tcBorders>
@@ -791,7 +751,7 @@
         </w:tc>
         <w:tc>
           <w:tcPr>
-            <w:tcW w:w="1929" w:type="dxa"/>
+            <w:tcW w:w="1931" w:type="dxa"/>
             <w:tcBorders>
               <w:start w:val="single" w:sz="4" w:space="0" w:color="000000"/>
             </w:tcBorders>
@@ -835,7 +795,7 @@
         <w:trPr/>
         <w:tc>
           <w:tcPr>
-            <w:tcW w:w="1974" w:type="dxa"/>
+            <w:tcW w:w="1972" w:type="dxa"/>
             <w:tcBorders>
               <w:start w:val="single" w:sz="4" w:space="0" w:color="000000"/>
             </w:tcBorders>
@@ -855,7 +815,7 @@
         </w:tc>
         <w:tc>
           <w:tcPr>
-            <w:tcW w:w="1881" w:type="dxa"/>
+            <w:tcW w:w="1883" w:type="dxa"/>
             <w:tcBorders>
               <w:start w:val="single" w:sz="4" w:space="0" w:color="000000"/>
             </w:tcBorders>
@@ -875,7 +835,7 @@
         </w:tc>
         <w:tc>
           <w:tcPr>
-            <w:tcW w:w="1926" w:type="dxa"/>
+            <w:tcW w:w="1924" w:type="dxa"/>
             <w:tcBorders>
               <w:start w:val="single" w:sz="4" w:space="0" w:color="000000"/>
             </w:tcBorders>
@@ -895,7 +855,7 @@
         </w:tc>
         <w:tc>
           <w:tcPr>
-            <w:tcW w:w="1929" w:type="dxa"/>
+            <w:tcW w:w="1931" w:type="dxa"/>
             <w:tcBorders>
               <w:start w:val="single" w:sz="4" w:space="0" w:color="000000"/>
             </w:tcBorders>
@@ -939,7 +899,7 @@
         <w:trPr/>
         <w:tc>
           <w:tcPr>
-            <w:tcW w:w="1974" w:type="dxa"/>
+            <w:tcW w:w="1972" w:type="dxa"/>
             <w:tcBorders>
               <w:start w:val="single" w:sz="4" w:space="0" w:color="000000"/>
               <w:bottom w:val="single" w:sz="4" w:space="0" w:color="000000"/>
@@ -960,7 +920,7 @@
         </w:tc>
         <w:tc>
           <w:tcPr>
-            <w:tcW w:w="1881" w:type="dxa"/>
+            <w:tcW w:w="1883" w:type="dxa"/>
             <w:tcBorders>
               <w:start w:val="single" w:sz="4" w:space="0" w:color="000000"/>
               <w:bottom w:val="single" w:sz="4" w:space="0" w:color="000000"/>
@@ -981,7 +941,7 @@
         </w:tc>
         <w:tc>
           <w:tcPr>
-            <w:tcW w:w="1926" w:type="dxa"/>
+            <w:tcW w:w="1924" w:type="dxa"/>
             <w:tcBorders>
               <w:start w:val="single" w:sz="4" w:space="0" w:color="000000"/>
               <w:bottom w:val="single" w:sz="4" w:space="0" w:color="000000"/>
@@ -1002,7 +962,7 @@
         </w:tc>
         <w:tc>
           <w:tcPr>
-            <w:tcW w:w="1929" w:type="dxa"/>
+            <w:tcW w:w="1931" w:type="dxa"/>
             <w:tcBorders>
               <w:start w:val="single" w:sz="4" w:space="0" w:color="000000"/>
               <w:bottom w:val="single" w:sz="4" w:space="0" w:color="000000"/>
@@ -1054,6 +1014,30 @@
       </w:pPr>
       <w:r>
         <w:rPr/>
+      </w:r>
+    </w:p>
+    <w:p>
+      <w:pPr>
+        <w:pStyle w:val="Normal"/>
+        <w:bidi w:val="0"/>
+        <w:jc w:val="center"/>
+        <w:rPr/>
+      </w:pPr>
+      <w:r>
+        <w:rPr/>
+        <w:t>INTEGRATION TESTS</w:t>
+      </w:r>
+    </w:p>
+    <w:p>
+      <w:pPr>
+        <w:pStyle w:val="Normal"/>
+        <w:bidi w:val="0"/>
+        <w:jc w:val="both"/>
+        <w:rPr/>
+      </w:pPr>
+      <w:r>
+        <w:rPr/>
+        <w:t>Perform tests on mostly on Domain Integrity and Entity integrity with just very few tests on Referential Integrity.</w:t>
       </w:r>
     </w:p>
     <w:sectPr>

</xml_diff>

<commit_message>
Created database tests for post APIs. POSTS PASSED ALL DATABSE TESTS SUCCESSFULLY.
</commit_message>
<xml_diff>
--- a/Portal_Database_Design/Post_APIs.docx
+++ b/Portal_Database_Design/Post_APIs.docx
@@ -16,17 +16,17 @@
         </w:tblCellMar>
       </w:tblPr>
       <w:tblGrid>
-        <w:gridCol w:w="1972"/>
-        <w:gridCol w:w="1883"/>
-        <w:gridCol w:w="1924"/>
-        <w:gridCol w:w="1931"/>
+        <w:gridCol w:w="1971"/>
+        <w:gridCol w:w="1884"/>
+        <w:gridCol w:w="1923"/>
+        <w:gridCol w:w="1932"/>
         <w:gridCol w:w="1928"/>
       </w:tblGrid>
       <w:tr>
         <w:trPr/>
         <w:tc>
           <w:tcPr>
-            <w:tcW w:w="1972" w:type="dxa"/>
+            <w:tcW w:w="1971" w:type="dxa"/>
             <w:tcBorders>
               <w:top w:val="single" w:sz="4" w:space="0" w:color="000000"/>
               <w:start w:val="single" w:sz="4" w:space="0" w:color="000000"/>
@@ -75,7 +75,7 @@
         </w:tc>
         <w:tc>
           <w:tcPr>
-            <w:tcW w:w="1883" w:type="dxa"/>
+            <w:tcW w:w="1884" w:type="dxa"/>
             <w:tcBorders>
               <w:top w:val="single" w:sz="4" w:space="0" w:color="000000"/>
               <w:start w:val="single" w:sz="4" w:space="0" w:color="000000"/>
@@ -124,7 +124,7 @@
         </w:tc>
         <w:tc>
           <w:tcPr>
-            <w:tcW w:w="1924" w:type="dxa"/>
+            <w:tcW w:w="1923" w:type="dxa"/>
             <w:tcBorders>
               <w:top w:val="single" w:sz="4" w:space="0" w:color="000000"/>
               <w:start w:val="single" w:sz="4" w:space="0" w:color="000000"/>
@@ -173,7 +173,7 @@
         </w:tc>
         <w:tc>
           <w:tcPr>
-            <w:tcW w:w="1931" w:type="dxa"/>
+            <w:tcW w:w="1932" w:type="dxa"/>
             <w:tcBorders>
               <w:top w:val="single" w:sz="4" w:space="0" w:color="000000"/>
               <w:start w:val="single" w:sz="4" w:space="0" w:color="000000"/>
@@ -275,7 +275,7 @@
         <w:trPr/>
         <w:tc>
           <w:tcPr>
-            <w:tcW w:w="1972" w:type="dxa"/>
+            <w:tcW w:w="1971" w:type="dxa"/>
             <w:tcBorders>
               <w:start w:val="single" w:sz="4" w:space="0" w:color="000000"/>
             </w:tcBorders>
@@ -295,7 +295,7 @@
         </w:tc>
         <w:tc>
           <w:tcPr>
-            <w:tcW w:w="1883" w:type="dxa"/>
+            <w:tcW w:w="1884" w:type="dxa"/>
             <w:tcBorders>
               <w:start w:val="single" w:sz="4" w:space="0" w:color="000000"/>
             </w:tcBorders>
@@ -315,7 +315,7 @@
         </w:tc>
         <w:tc>
           <w:tcPr>
-            <w:tcW w:w="1924" w:type="dxa"/>
+            <w:tcW w:w="1923" w:type="dxa"/>
             <w:tcBorders>
               <w:start w:val="single" w:sz="4" w:space="0" w:color="000000"/>
             </w:tcBorders>
@@ -335,7 +335,7 @@
         </w:tc>
         <w:tc>
           <w:tcPr>
-            <w:tcW w:w="1931" w:type="dxa"/>
+            <w:tcW w:w="1932" w:type="dxa"/>
             <w:tcBorders>
               <w:start w:val="single" w:sz="4" w:space="0" w:color="000000"/>
             </w:tcBorders>
@@ -379,7 +379,7 @@
         <w:trPr/>
         <w:tc>
           <w:tcPr>
-            <w:tcW w:w="1972" w:type="dxa"/>
+            <w:tcW w:w="1971" w:type="dxa"/>
             <w:tcBorders>
               <w:start w:val="single" w:sz="4" w:space="0" w:color="000000"/>
             </w:tcBorders>
@@ -399,7 +399,7 @@
         </w:tc>
         <w:tc>
           <w:tcPr>
-            <w:tcW w:w="1883" w:type="dxa"/>
+            <w:tcW w:w="1884" w:type="dxa"/>
             <w:tcBorders>
               <w:start w:val="single" w:sz="4" w:space="0" w:color="000000"/>
             </w:tcBorders>
@@ -419,7 +419,7 @@
         </w:tc>
         <w:tc>
           <w:tcPr>
-            <w:tcW w:w="1924" w:type="dxa"/>
+            <w:tcW w:w="1923" w:type="dxa"/>
             <w:tcBorders>
               <w:start w:val="single" w:sz="4" w:space="0" w:color="000000"/>
             </w:tcBorders>
@@ -439,7 +439,7 @@
         </w:tc>
         <w:tc>
           <w:tcPr>
-            <w:tcW w:w="1931" w:type="dxa"/>
+            <w:tcW w:w="1932" w:type="dxa"/>
             <w:tcBorders>
               <w:start w:val="single" w:sz="4" w:space="0" w:color="000000"/>
             </w:tcBorders>
@@ -483,7 +483,7 @@
         <w:trPr/>
         <w:tc>
           <w:tcPr>
-            <w:tcW w:w="1972" w:type="dxa"/>
+            <w:tcW w:w="1971" w:type="dxa"/>
             <w:tcBorders>
               <w:start w:val="single" w:sz="4" w:space="0" w:color="000000"/>
             </w:tcBorders>
@@ -503,7 +503,7 @@
         </w:tc>
         <w:tc>
           <w:tcPr>
-            <w:tcW w:w="1883" w:type="dxa"/>
+            <w:tcW w:w="1884" w:type="dxa"/>
             <w:tcBorders>
               <w:start w:val="single" w:sz="4" w:space="0" w:color="000000"/>
             </w:tcBorders>
@@ -523,7 +523,7 @@
         </w:tc>
         <w:tc>
           <w:tcPr>
-            <w:tcW w:w="1924" w:type="dxa"/>
+            <w:tcW w:w="1923" w:type="dxa"/>
             <w:tcBorders>
               <w:start w:val="single" w:sz="4" w:space="0" w:color="000000"/>
             </w:tcBorders>
@@ -543,7 +543,7 @@
         </w:tc>
         <w:tc>
           <w:tcPr>
-            <w:tcW w:w="1931" w:type="dxa"/>
+            <w:tcW w:w="1932" w:type="dxa"/>
             <w:tcBorders>
               <w:start w:val="single" w:sz="4" w:space="0" w:color="000000"/>
             </w:tcBorders>
@@ -587,7 +587,7 @@
         <w:trPr/>
         <w:tc>
           <w:tcPr>
-            <w:tcW w:w="1972" w:type="dxa"/>
+            <w:tcW w:w="1971" w:type="dxa"/>
             <w:tcBorders>
               <w:start w:val="single" w:sz="4" w:space="0" w:color="000000"/>
             </w:tcBorders>
@@ -607,7 +607,7 @@
         </w:tc>
         <w:tc>
           <w:tcPr>
-            <w:tcW w:w="1883" w:type="dxa"/>
+            <w:tcW w:w="1884" w:type="dxa"/>
             <w:tcBorders>
               <w:start w:val="single" w:sz="4" w:space="0" w:color="000000"/>
             </w:tcBorders>
@@ -627,7 +627,7 @@
         </w:tc>
         <w:tc>
           <w:tcPr>
-            <w:tcW w:w="1924" w:type="dxa"/>
+            <w:tcW w:w="1923" w:type="dxa"/>
             <w:tcBorders>
               <w:start w:val="single" w:sz="4" w:space="0" w:color="000000"/>
             </w:tcBorders>
@@ -647,7 +647,7 @@
         </w:tc>
         <w:tc>
           <w:tcPr>
-            <w:tcW w:w="1931" w:type="dxa"/>
+            <w:tcW w:w="1932" w:type="dxa"/>
             <w:tcBorders>
               <w:start w:val="single" w:sz="4" w:space="0" w:color="000000"/>
             </w:tcBorders>
@@ -691,7 +691,7 @@
         <w:trPr/>
         <w:tc>
           <w:tcPr>
-            <w:tcW w:w="1972" w:type="dxa"/>
+            <w:tcW w:w="1971" w:type="dxa"/>
             <w:tcBorders>
               <w:start w:val="single" w:sz="4" w:space="0" w:color="000000"/>
             </w:tcBorders>
@@ -711,7 +711,7 @@
         </w:tc>
         <w:tc>
           <w:tcPr>
-            <w:tcW w:w="1883" w:type="dxa"/>
+            <w:tcW w:w="1884" w:type="dxa"/>
             <w:tcBorders>
               <w:start w:val="single" w:sz="4" w:space="0" w:color="000000"/>
             </w:tcBorders>
@@ -731,7 +731,7 @@
         </w:tc>
         <w:tc>
           <w:tcPr>
-            <w:tcW w:w="1924" w:type="dxa"/>
+            <w:tcW w:w="1923" w:type="dxa"/>
             <w:tcBorders>
               <w:start w:val="single" w:sz="4" w:space="0" w:color="000000"/>
             </w:tcBorders>
@@ -751,7 +751,7 @@
         </w:tc>
         <w:tc>
           <w:tcPr>
-            <w:tcW w:w="1931" w:type="dxa"/>
+            <w:tcW w:w="1932" w:type="dxa"/>
             <w:tcBorders>
               <w:start w:val="single" w:sz="4" w:space="0" w:color="000000"/>
             </w:tcBorders>
@@ -795,7 +795,7 @@
         <w:trPr/>
         <w:tc>
           <w:tcPr>
-            <w:tcW w:w="1972" w:type="dxa"/>
+            <w:tcW w:w="1971" w:type="dxa"/>
             <w:tcBorders>
               <w:start w:val="single" w:sz="4" w:space="0" w:color="000000"/>
             </w:tcBorders>
@@ -815,7 +815,7 @@
         </w:tc>
         <w:tc>
           <w:tcPr>
-            <w:tcW w:w="1883" w:type="dxa"/>
+            <w:tcW w:w="1884" w:type="dxa"/>
             <w:tcBorders>
               <w:start w:val="single" w:sz="4" w:space="0" w:color="000000"/>
             </w:tcBorders>
@@ -835,7 +835,7 @@
         </w:tc>
         <w:tc>
           <w:tcPr>
-            <w:tcW w:w="1924" w:type="dxa"/>
+            <w:tcW w:w="1923" w:type="dxa"/>
             <w:tcBorders>
               <w:start w:val="single" w:sz="4" w:space="0" w:color="000000"/>
             </w:tcBorders>
@@ -855,7 +855,7 @@
         </w:tc>
         <w:tc>
           <w:tcPr>
-            <w:tcW w:w="1931" w:type="dxa"/>
+            <w:tcW w:w="1932" w:type="dxa"/>
             <w:tcBorders>
               <w:start w:val="single" w:sz="4" w:space="0" w:color="000000"/>
             </w:tcBorders>
@@ -899,7 +899,7 @@
         <w:trPr/>
         <w:tc>
           <w:tcPr>
-            <w:tcW w:w="1972" w:type="dxa"/>
+            <w:tcW w:w="1971" w:type="dxa"/>
             <w:tcBorders>
               <w:start w:val="single" w:sz="4" w:space="0" w:color="000000"/>
               <w:bottom w:val="single" w:sz="4" w:space="0" w:color="000000"/>
@@ -920,7 +920,7 @@
         </w:tc>
         <w:tc>
           <w:tcPr>
-            <w:tcW w:w="1883" w:type="dxa"/>
+            <w:tcW w:w="1884" w:type="dxa"/>
             <w:tcBorders>
               <w:start w:val="single" w:sz="4" w:space="0" w:color="000000"/>
               <w:bottom w:val="single" w:sz="4" w:space="0" w:color="000000"/>
@@ -941,7 +941,7 @@
         </w:tc>
         <w:tc>
           <w:tcPr>
-            <w:tcW w:w="1924" w:type="dxa"/>
+            <w:tcW w:w="1923" w:type="dxa"/>
             <w:tcBorders>
               <w:start w:val="single" w:sz="4" w:space="0" w:color="000000"/>
               <w:bottom w:val="single" w:sz="4" w:space="0" w:color="000000"/>
@@ -962,7 +962,7 @@
         </w:tc>
         <w:tc>
           <w:tcPr>
-            <w:tcW w:w="1931" w:type="dxa"/>
+            <w:tcW w:w="1932" w:type="dxa"/>
             <w:tcBorders>
               <w:start w:val="single" w:sz="4" w:space="0" w:color="000000"/>
               <w:bottom w:val="single" w:sz="4" w:space="0" w:color="000000"/>
@@ -1038,6 +1038,232 @@
       <w:r>
         <w:rPr/>
         <w:t>Perform tests on mostly on Domain Integrity and Entity integrity with just very few tests on Referential Integrity.</w:t>
+      </w:r>
+    </w:p>
+    <w:p>
+      <w:pPr>
+        <w:pStyle w:val="Normal"/>
+        <w:bidi w:val="0"/>
+        <w:jc w:val="both"/>
+        <w:rPr/>
+      </w:pPr>
+      <w:r>
+        <w:rPr/>
+      </w:r>
+    </w:p>
+    <w:p>
+      <w:pPr>
+        <w:pStyle w:val="Normal"/>
+        <w:bidi w:val="0"/>
+        <w:jc w:val="center"/>
+        <w:rPr/>
+      </w:pPr>
+      <w:r>
+        <w:rPr/>
+        <w:t>DATABASE TESTS</w:t>
+      </w:r>
+    </w:p>
+    <w:p>
+      <w:pPr>
+        <w:pStyle w:val="Normal"/>
+        <w:bidi w:val="0"/>
+        <w:jc w:val="both"/>
+        <w:rPr>
+          <w:b w:val="false"/>
+          <w:bCs w:val="false"/>
+        </w:rPr>
+      </w:pPr>
+      <w:r>
+        <w:rPr>
+          <w:b w:val="false"/>
+          <w:bCs w:val="false"/>
+        </w:rPr>
+        <w:t xml:space="preserve">* </w:t>
+      </w:r>
+      <w:bookmarkStart w:id="0" w:name="__DdeLink__382_481068113"/>
+      <w:r>
+        <w:rPr>
+          <w:b w:val="false"/>
+          <w:bCs w:val="false"/>
+        </w:rPr>
+        <w:t xml:space="preserve">Create a POST with the following details ( </w:t>
+      </w:r>
+      <w:bookmarkStart w:id="1" w:name="__DdeLink__386_481068113"/>
+      <w:r>
+        <w:rPr>
+          <w:b w:val="false"/>
+          <w:bCs w:val="false"/>
+        </w:rPr>
+        <w:t>post_content, user_id, post_status</w:t>
+      </w:r>
+      <w:bookmarkEnd w:id="1"/>
+      <w:r>
+        <w:rPr>
+          <w:b w:val="false"/>
+          <w:bCs w:val="false"/>
+        </w:rPr>
+        <w:t>) (</w:t>
+      </w:r>
+      <w:bookmarkStart w:id="2" w:name="__DdeLink__388_481068113"/>
+      <w:r>
+        <w:rPr>
+          <w:b w:val="false"/>
+          <w:bCs w:val="false"/>
+        </w:rPr>
+        <w:t>“</w:t>
+      </w:r>
+      <w:bookmarkStart w:id="3" w:name="__DdeLink__390_481068113"/>
+      <w:r>
+        <w:rPr>
+          <w:b w:val="false"/>
+          <w:bCs w:val="false"/>
+        </w:rPr>
+        <w:t>Test Post 2 for user JULF”,  9, open</w:t>
+      </w:r>
+      <w:bookmarkEnd w:id="2"/>
+      <w:r>
+        <w:rPr>
+          <w:b w:val="false"/>
+          <w:bCs w:val="false"/>
+        </w:rPr>
+        <w:t>)</w:t>
+      </w:r>
+      <w:bookmarkEnd w:id="3"/>
+      <w:r>
+        <w:rPr>
+          <w:b w:val="false"/>
+          <w:bCs w:val="false"/>
+        </w:rPr>
+        <w:t>. Here, we are trying to test if duplicate post_content is allowed.</w:t>
+      </w:r>
+      <w:bookmarkEnd w:id="0"/>
+      <w:r>
+        <w:rPr>
+          <w:b w:val="false"/>
+          <w:bCs w:val="false"/>
+        </w:rPr>
+        <w:t xml:space="preserve"> </w:t>
+      </w:r>
+      <w:bookmarkStart w:id="4" w:name="__DdeLink__384_481068113"/>
+      <w:r>
+        <w:rPr>
+          <w:b w:val="false"/>
+          <w:bCs w:val="false"/>
+        </w:rPr>
+        <w:t>This tests whether a UNIQUE constraint exists for the post_content column</w:t>
+      </w:r>
+      <w:bookmarkEnd w:id="4"/>
+      <w:r>
+        <w:rPr>
+          <w:b w:val="false"/>
+          <w:bCs w:val="false"/>
+        </w:rPr>
+        <w:t xml:space="preserve">. </w:t>
+      </w:r>
+    </w:p>
+    <w:p>
+      <w:pPr>
+        <w:pStyle w:val="Normal"/>
+        <w:bidi w:val="0"/>
+        <w:jc w:val="both"/>
+        <w:rPr>
+          <w:b w:val="false"/>
+          <w:bCs w:val="false"/>
+        </w:rPr>
+      </w:pPr>
+      <w:r>
+        <w:rPr>
+          <w:b w:val="false"/>
+          <w:bCs w:val="false"/>
+        </w:rPr>
+      </w:r>
+    </w:p>
+    <w:p>
+      <w:pPr>
+        <w:pStyle w:val="Normal"/>
+        <w:bidi w:val="0"/>
+        <w:jc w:val="both"/>
+        <w:rPr>
+          <w:b w:val="false"/>
+          <w:bCs w:val="false"/>
+        </w:rPr>
+      </w:pPr>
+      <w:r>
+        <w:rPr>
+          <w:b w:val="false"/>
+          <w:bCs w:val="false"/>
+        </w:rPr>
+        <w:t>* Create a POST with the following details ( post_content, post_title, user_id, post_status) (“Some Test Post Content”, “JULF Test Post 2”, 9, open). Here, we are trying to test if duplicate post_title is allowed.  This tests whether a UNIQUE constraint exists for the post_title column.</w:t>
+      </w:r>
+    </w:p>
+    <w:p>
+      <w:pPr>
+        <w:pStyle w:val="Normal"/>
+        <w:bidi w:val="0"/>
+        <w:jc w:val="both"/>
+        <w:rPr>
+          <w:b w:val="false"/>
+          <w:bCs w:val="false"/>
+        </w:rPr>
+      </w:pPr>
+      <w:r>
+        <w:rPr>
+          <w:b w:val="false"/>
+          <w:bCs w:val="false"/>
+        </w:rPr>
+      </w:r>
+    </w:p>
+    <w:p>
+      <w:pPr>
+        <w:pStyle w:val="Normal"/>
+        <w:bidi w:val="0"/>
+        <w:jc w:val="both"/>
+        <w:rPr>
+          <w:b w:val="false"/>
+          <w:bCs w:val="false"/>
+        </w:rPr>
+      </w:pPr>
+      <w:r>
+        <w:rPr>
+          <w:b w:val="false"/>
+          <w:bCs w:val="false"/>
+        </w:rPr>
+        <w:t>* Delete the POST with post_title “JULF Test Post 2” and post_content “Test Post 2 for user JULF”. This will tell us what happens to the corresponding user when this post is deleted. Here, we are checking referential integrity w.r.t user_id.</w:t>
+      </w:r>
+    </w:p>
+    <w:p>
+      <w:pPr>
+        <w:pStyle w:val="Normal"/>
+        <w:bidi w:val="0"/>
+        <w:jc w:val="both"/>
+        <w:rPr>
+          <w:b w:val="false"/>
+          <w:bCs w:val="false"/>
+        </w:rPr>
+      </w:pPr>
+      <w:r>
+        <w:rPr>
+          <w:b w:val="false"/>
+          <w:bCs w:val="false"/>
+        </w:rPr>
+      </w:r>
+    </w:p>
+    <w:p>
+      <w:pPr>
+        <w:pStyle w:val="Normal"/>
+        <w:bidi w:val="0"/>
+        <w:jc w:val="both"/>
+        <w:rPr>
+          <w:b w:val="false"/>
+          <w:bCs w:val="false"/>
+        </w:rPr>
+      </w:pPr>
+      <w:r>
+        <w:rPr>
+          <w:b w:val="false"/>
+          <w:bCs w:val="false"/>
+        </w:rPr>
+        <w:t>* Create a POST with the following details (post_content, post_title, user_id, post_status) (Test Post 2 for user JULF”, “JULF Test Post 2”  9, open). We are doing this test, so that the deleted post is re-created. This way, we can run these tests repeatedly.</w:t>
       </w:r>
     </w:p>
     <w:sectPr>

</xml_diff>

<commit_message>
Added notes to PST_APIs.docx.
</commit_message>
<xml_diff>
--- a/Portal_Database_Design/Post_APIs.docx
+++ b/Portal_Database_Design/Post_APIs.docx
@@ -16,17 +16,17 @@
         </w:tblCellMar>
       </w:tblPr>
       <w:tblGrid>
-        <w:gridCol w:w="1971"/>
-        <w:gridCol w:w="1884"/>
-        <w:gridCol w:w="1923"/>
-        <w:gridCol w:w="1932"/>
+        <w:gridCol w:w="1969"/>
+        <w:gridCol w:w="1886"/>
+        <w:gridCol w:w="1921"/>
+        <w:gridCol w:w="1934"/>
         <w:gridCol w:w="1928"/>
       </w:tblGrid>
       <w:tr>
         <w:trPr/>
         <w:tc>
           <w:tcPr>
-            <w:tcW w:w="1971" w:type="dxa"/>
+            <w:tcW w:w="1969" w:type="dxa"/>
             <w:tcBorders>
               <w:top w:val="single" w:sz="4" w:space="0" w:color="000000"/>
               <w:start w:val="single" w:sz="4" w:space="0" w:color="000000"/>
@@ -75,7 +75,7 @@
         </w:tc>
         <w:tc>
           <w:tcPr>
-            <w:tcW w:w="1884" w:type="dxa"/>
+            <w:tcW w:w="1886" w:type="dxa"/>
             <w:tcBorders>
               <w:top w:val="single" w:sz="4" w:space="0" w:color="000000"/>
               <w:start w:val="single" w:sz="4" w:space="0" w:color="000000"/>
@@ -124,7 +124,7 @@
         </w:tc>
         <w:tc>
           <w:tcPr>
-            <w:tcW w:w="1923" w:type="dxa"/>
+            <w:tcW w:w="1921" w:type="dxa"/>
             <w:tcBorders>
               <w:top w:val="single" w:sz="4" w:space="0" w:color="000000"/>
               <w:start w:val="single" w:sz="4" w:space="0" w:color="000000"/>
@@ -173,7 +173,7 @@
         </w:tc>
         <w:tc>
           <w:tcPr>
-            <w:tcW w:w="1932" w:type="dxa"/>
+            <w:tcW w:w="1934" w:type="dxa"/>
             <w:tcBorders>
               <w:top w:val="single" w:sz="4" w:space="0" w:color="000000"/>
               <w:start w:val="single" w:sz="4" w:space="0" w:color="000000"/>
@@ -275,7 +275,7 @@
         <w:trPr/>
         <w:tc>
           <w:tcPr>
-            <w:tcW w:w="1971" w:type="dxa"/>
+            <w:tcW w:w="1969" w:type="dxa"/>
             <w:tcBorders>
               <w:start w:val="single" w:sz="4" w:space="0" w:color="000000"/>
             </w:tcBorders>
@@ -295,7 +295,7 @@
         </w:tc>
         <w:tc>
           <w:tcPr>
-            <w:tcW w:w="1884" w:type="dxa"/>
+            <w:tcW w:w="1886" w:type="dxa"/>
             <w:tcBorders>
               <w:start w:val="single" w:sz="4" w:space="0" w:color="000000"/>
             </w:tcBorders>
@@ -315,7 +315,7 @@
         </w:tc>
         <w:tc>
           <w:tcPr>
-            <w:tcW w:w="1923" w:type="dxa"/>
+            <w:tcW w:w="1921" w:type="dxa"/>
             <w:tcBorders>
               <w:start w:val="single" w:sz="4" w:space="0" w:color="000000"/>
             </w:tcBorders>
@@ -335,7 +335,7 @@
         </w:tc>
         <w:tc>
           <w:tcPr>
-            <w:tcW w:w="1932" w:type="dxa"/>
+            <w:tcW w:w="1934" w:type="dxa"/>
             <w:tcBorders>
               <w:start w:val="single" w:sz="4" w:space="0" w:color="000000"/>
             </w:tcBorders>
@@ -379,7 +379,7 @@
         <w:trPr/>
         <w:tc>
           <w:tcPr>
-            <w:tcW w:w="1971" w:type="dxa"/>
+            <w:tcW w:w="1969" w:type="dxa"/>
             <w:tcBorders>
               <w:start w:val="single" w:sz="4" w:space="0" w:color="000000"/>
             </w:tcBorders>
@@ -399,7 +399,7 @@
         </w:tc>
         <w:tc>
           <w:tcPr>
-            <w:tcW w:w="1884" w:type="dxa"/>
+            <w:tcW w:w="1886" w:type="dxa"/>
             <w:tcBorders>
               <w:start w:val="single" w:sz="4" w:space="0" w:color="000000"/>
             </w:tcBorders>
@@ -419,7 +419,7 @@
         </w:tc>
         <w:tc>
           <w:tcPr>
-            <w:tcW w:w="1923" w:type="dxa"/>
+            <w:tcW w:w="1921" w:type="dxa"/>
             <w:tcBorders>
               <w:start w:val="single" w:sz="4" w:space="0" w:color="000000"/>
             </w:tcBorders>
@@ -439,7 +439,7 @@
         </w:tc>
         <w:tc>
           <w:tcPr>
-            <w:tcW w:w="1932" w:type="dxa"/>
+            <w:tcW w:w="1934" w:type="dxa"/>
             <w:tcBorders>
               <w:start w:val="single" w:sz="4" w:space="0" w:color="000000"/>
             </w:tcBorders>
@@ -483,7 +483,7 @@
         <w:trPr/>
         <w:tc>
           <w:tcPr>
-            <w:tcW w:w="1971" w:type="dxa"/>
+            <w:tcW w:w="1969" w:type="dxa"/>
             <w:tcBorders>
               <w:start w:val="single" w:sz="4" w:space="0" w:color="000000"/>
             </w:tcBorders>
@@ -503,7 +503,7 @@
         </w:tc>
         <w:tc>
           <w:tcPr>
-            <w:tcW w:w="1884" w:type="dxa"/>
+            <w:tcW w:w="1886" w:type="dxa"/>
             <w:tcBorders>
               <w:start w:val="single" w:sz="4" w:space="0" w:color="000000"/>
             </w:tcBorders>
@@ -523,7 +523,7 @@
         </w:tc>
         <w:tc>
           <w:tcPr>
-            <w:tcW w:w="1923" w:type="dxa"/>
+            <w:tcW w:w="1921" w:type="dxa"/>
             <w:tcBorders>
               <w:start w:val="single" w:sz="4" w:space="0" w:color="000000"/>
             </w:tcBorders>
@@ -543,7 +543,7 @@
         </w:tc>
         <w:tc>
           <w:tcPr>
-            <w:tcW w:w="1932" w:type="dxa"/>
+            <w:tcW w:w="1934" w:type="dxa"/>
             <w:tcBorders>
               <w:start w:val="single" w:sz="4" w:space="0" w:color="000000"/>
             </w:tcBorders>
@@ -587,7 +587,7 @@
         <w:trPr/>
         <w:tc>
           <w:tcPr>
-            <w:tcW w:w="1971" w:type="dxa"/>
+            <w:tcW w:w="1969" w:type="dxa"/>
             <w:tcBorders>
               <w:start w:val="single" w:sz="4" w:space="0" w:color="000000"/>
             </w:tcBorders>
@@ -607,7 +607,7 @@
         </w:tc>
         <w:tc>
           <w:tcPr>
-            <w:tcW w:w="1884" w:type="dxa"/>
+            <w:tcW w:w="1886" w:type="dxa"/>
             <w:tcBorders>
               <w:start w:val="single" w:sz="4" w:space="0" w:color="000000"/>
             </w:tcBorders>
@@ -627,7 +627,7 @@
         </w:tc>
         <w:tc>
           <w:tcPr>
-            <w:tcW w:w="1923" w:type="dxa"/>
+            <w:tcW w:w="1921" w:type="dxa"/>
             <w:tcBorders>
               <w:start w:val="single" w:sz="4" w:space="0" w:color="000000"/>
             </w:tcBorders>
@@ -647,7 +647,7 @@
         </w:tc>
         <w:tc>
           <w:tcPr>
-            <w:tcW w:w="1932" w:type="dxa"/>
+            <w:tcW w:w="1934" w:type="dxa"/>
             <w:tcBorders>
               <w:start w:val="single" w:sz="4" w:space="0" w:color="000000"/>
             </w:tcBorders>
@@ -691,7 +691,7 @@
         <w:trPr/>
         <w:tc>
           <w:tcPr>
-            <w:tcW w:w="1971" w:type="dxa"/>
+            <w:tcW w:w="1969" w:type="dxa"/>
             <w:tcBorders>
               <w:start w:val="single" w:sz="4" w:space="0" w:color="000000"/>
             </w:tcBorders>
@@ -711,7 +711,7 @@
         </w:tc>
         <w:tc>
           <w:tcPr>
-            <w:tcW w:w="1884" w:type="dxa"/>
+            <w:tcW w:w="1886" w:type="dxa"/>
             <w:tcBorders>
               <w:start w:val="single" w:sz="4" w:space="0" w:color="000000"/>
             </w:tcBorders>
@@ -731,7 +731,7 @@
         </w:tc>
         <w:tc>
           <w:tcPr>
-            <w:tcW w:w="1923" w:type="dxa"/>
+            <w:tcW w:w="1921" w:type="dxa"/>
             <w:tcBorders>
               <w:start w:val="single" w:sz="4" w:space="0" w:color="000000"/>
             </w:tcBorders>
@@ -751,7 +751,7 @@
         </w:tc>
         <w:tc>
           <w:tcPr>
-            <w:tcW w:w="1932" w:type="dxa"/>
+            <w:tcW w:w="1934" w:type="dxa"/>
             <w:tcBorders>
               <w:start w:val="single" w:sz="4" w:space="0" w:color="000000"/>
             </w:tcBorders>
@@ -795,7 +795,7 @@
         <w:trPr/>
         <w:tc>
           <w:tcPr>
-            <w:tcW w:w="1971" w:type="dxa"/>
+            <w:tcW w:w="1969" w:type="dxa"/>
             <w:tcBorders>
               <w:start w:val="single" w:sz="4" w:space="0" w:color="000000"/>
             </w:tcBorders>
@@ -815,7 +815,7 @@
         </w:tc>
         <w:tc>
           <w:tcPr>
-            <w:tcW w:w="1884" w:type="dxa"/>
+            <w:tcW w:w="1886" w:type="dxa"/>
             <w:tcBorders>
               <w:start w:val="single" w:sz="4" w:space="0" w:color="000000"/>
             </w:tcBorders>
@@ -835,7 +835,7 @@
         </w:tc>
         <w:tc>
           <w:tcPr>
-            <w:tcW w:w="1923" w:type="dxa"/>
+            <w:tcW w:w="1921" w:type="dxa"/>
             <w:tcBorders>
               <w:start w:val="single" w:sz="4" w:space="0" w:color="000000"/>
             </w:tcBorders>
@@ -855,7 +855,7 @@
         </w:tc>
         <w:tc>
           <w:tcPr>
-            <w:tcW w:w="1932" w:type="dxa"/>
+            <w:tcW w:w="1934" w:type="dxa"/>
             <w:tcBorders>
               <w:start w:val="single" w:sz="4" w:space="0" w:color="000000"/>
             </w:tcBorders>
@@ -899,7 +899,7 @@
         <w:trPr/>
         <w:tc>
           <w:tcPr>
-            <w:tcW w:w="1971" w:type="dxa"/>
+            <w:tcW w:w="1969" w:type="dxa"/>
             <w:tcBorders>
               <w:start w:val="single" w:sz="4" w:space="0" w:color="000000"/>
               <w:bottom w:val="single" w:sz="4" w:space="0" w:color="000000"/>
@@ -920,7 +920,7 @@
         </w:tc>
         <w:tc>
           <w:tcPr>
-            <w:tcW w:w="1884" w:type="dxa"/>
+            <w:tcW w:w="1886" w:type="dxa"/>
             <w:tcBorders>
               <w:start w:val="single" w:sz="4" w:space="0" w:color="000000"/>
               <w:bottom w:val="single" w:sz="4" w:space="0" w:color="000000"/>
@@ -941,7 +941,7 @@
         </w:tc>
         <w:tc>
           <w:tcPr>
-            <w:tcW w:w="1923" w:type="dxa"/>
+            <w:tcW w:w="1921" w:type="dxa"/>
             <w:tcBorders>
               <w:start w:val="single" w:sz="4" w:space="0" w:color="000000"/>
               <w:bottom w:val="single" w:sz="4" w:space="0" w:color="000000"/>
@@ -962,7 +962,7 @@
         </w:tc>
         <w:tc>
           <w:tcPr>
-            <w:tcW w:w="1932" w:type="dxa"/>
+            <w:tcW w:w="1934" w:type="dxa"/>
             <w:tcBorders>
               <w:start w:val="single" w:sz="4" w:space="0" w:color="000000"/>
               <w:bottom w:val="single" w:sz="4" w:space="0" w:color="000000"/>
@@ -1020,12 +1020,16 @@
       <w:pPr>
         <w:pStyle w:val="Normal"/>
         <w:bidi w:val="0"/>
-        <w:jc w:val="center"/>
+        <w:jc w:val="both"/>
         <w:rPr/>
       </w:pPr>
       <w:r>
         <w:rPr/>
-        <w:t>INTEGRATION TESTS</w:t>
+        <w:t xml:space="preserve">* </w:t>
+      </w:r>
+      <w:r>
+        <w:rPr/>
+        <w:t>NOTE: The user_id in createPost() will be gotten from the JWT when we have Authentication.</w:t>
       </w:r>
     </w:p>
     <w:p>
@@ -1037,7 +1041,6 @@
       </w:pPr>
       <w:r>
         <w:rPr/>
-        <w:t>Perform tests on mostly on Domain Integrity and Entity integrity with just very few tests on Referential Integrity.</w:t>
       </w:r>
     </w:p>
     <w:p>
@@ -1049,6 +1052,29 @@
       </w:pPr>
       <w:r>
         <w:rPr/>
+        <w:t xml:space="preserve">* NOTE: When we have authentication, then we either have to have a layer that checks </w:t>
+      </w:r>
+      <w:r>
+        <w:rPr>
+          <w:b/>
+          <w:bCs/>
+        </w:rPr>
+        <w:t>whether the user is logged in</w:t>
+      </w:r>
+      <w:r>
+        <w:rPr/>
+        <w:t xml:space="preserve"> or each of the POST service methods have to individually check </w:t>
+      </w:r>
+      <w:r>
+        <w:rPr>
+          <w:b/>
+          <w:bCs/>
+        </w:rPr>
+        <w:t>whether the user is logged in</w:t>
+      </w:r>
+      <w:r>
+        <w:rPr/>
+        <w:t>.</w:t>
       </w:r>
     </w:p>
     <w:p>
@@ -1060,7 +1086,7 @@
       </w:pPr>
       <w:r>
         <w:rPr/>
-        <w:t>DATABASE TESTS</w:t>
+        <w:t>INTEGRATION TESTS</w:t>
       </w:r>
     </w:p>
     <w:p>
@@ -1068,97 +1094,11 @@
         <w:pStyle w:val="Normal"/>
         <w:bidi w:val="0"/>
         <w:jc w:val="both"/>
-        <w:rPr>
-          <w:b w:val="false"/>
-          <w:bCs w:val="false"/>
-        </w:rPr>
+        <w:rPr/>
       </w:pPr>
       <w:r>
-        <w:rPr>
-          <w:b w:val="false"/>
-          <w:bCs w:val="false"/>
-        </w:rPr>
-        <w:t xml:space="preserve">* </w:t>
-      </w:r>
-      <w:bookmarkStart w:id="0" w:name="__DdeLink__382_481068113"/>
-      <w:r>
-        <w:rPr>
-          <w:b w:val="false"/>
-          <w:bCs w:val="false"/>
-        </w:rPr>
-        <w:t xml:space="preserve">Create a POST with the following details ( </w:t>
-      </w:r>
-      <w:bookmarkStart w:id="1" w:name="__DdeLink__386_481068113"/>
-      <w:r>
-        <w:rPr>
-          <w:b w:val="false"/>
-          <w:bCs w:val="false"/>
-        </w:rPr>
-        <w:t>post_content, user_id, post_status</w:t>
-      </w:r>
-      <w:bookmarkEnd w:id="1"/>
-      <w:r>
-        <w:rPr>
-          <w:b w:val="false"/>
-          <w:bCs w:val="false"/>
-        </w:rPr>
-        <w:t>) (</w:t>
-      </w:r>
-      <w:bookmarkStart w:id="2" w:name="__DdeLink__388_481068113"/>
-      <w:r>
-        <w:rPr>
-          <w:b w:val="false"/>
-          <w:bCs w:val="false"/>
-        </w:rPr>
-        <w:t>“</w:t>
-      </w:r>
-      <w:bookmarkStart w:id="3" w:name="__DdeLink__390_481068113"/>
-      <w:r>
-        <w:rPr>
-          <w:b w:val="false"/>
-          <w:bCs w:val="false"/>
-        </w:rPr>
-        <w:t>Test Post 2 for user JULF”,  9, open</w:t>
-      </w:r>
-      <w:bookmarkEnd w:id="2"/>
-      <w:r>
-        <w:rPr>
-          <w:b w:val="false"/>
-          <w:bCs w:val="false"/>
-        </w:rPr>
-        <w:t>)</w:t>
-      </w:r>
-      <w:bookmarkEnd w:id="3"/>
-      <w:r>
-        <w:rPr>
-          <w:b w:val="false"/>
-          <w:bCs w:val="false"/>
-        </w:rPr>
-        <w:t>. Here, we are trying to test if duplicate post_content is allowed.</w:t>
-      </w:r>
-      <w:bookmarkEnd w:id="0"/>
-      <w:r>
-        <w:rPr>
-          <w:b w:val="false"/>
-          <w:bCs w:val="false"/>
-        </w:rPr>
-        <w:t xml:space="preserve"> </w:t>
-      </w:r>
-      <w:bookmarkStart w:id="4" w:name="__DdeLink__384_481068113"/>
-      <w:r>
-        <w:rPr>
-          <w:b w:val="false"/>
-          <w:bCs w:val="false"/>
-        </w:rPr>
-        <w:t>This tests whether a UNIQUE constraint exists for the post_content column</w:t>
-      </w:r>
-      <w:bookmarkEnd w:id="4"/>
-      <w:r>
-        <w:rPr>
-          <w:b w:val="false"/>
-          <w:bCs w:val="false"/>
-        </w:rPr>
-        <w:t xml:space="preserve">. </w:t>
+        <w:rPr/>
+        <w:t>Perform tests on mostly on Domain Integrity and Entity integrity with just very few tests on Referential Integrity.</w:t>
       </w:r>
     </w:p>
     <w:p>
@@ -1166,16 +1106,22 @@
         <w:pStyle w:val="Normal"/>
         <w:bidi w:val="0"/>
         <w:jc w:val="both"/>
-        <w:rPr>
-          <w:b w:val="false"/>
-          <w:bCs w:val="false"/>
-        </w:rPr>
+        <w:rPr/>
       </w:pPr>
       <w:r>
-        <w:rPr>
-          <w:b w:val="false"/>
-          <w:bCs w:val="false"/>
-        </w:rPr>
+        <w:rPr/>
+      </w:r>
+    </w:p>
+    <w:p>
+      <w:pPr>
+        <w:pStyle w:val="Normal"/>
+        <w:bidi w:val="0"/>
+        <w:jc w:val="center"/>
+        <w:rPr/>
+      </w:pPr>
+      <w:r>
+        <w:rPr/>
+        <w:t>DATABASE TESTS</w:t>
       </w:r>
     </w:p>
     <w:p>
@@ -1193,7 +1139,87 @@
           <w:b w:val="false"/>
           <w:bCs w:val="false"/>
         </w:rPr>
-        <w:t>* Create a POST with the following details ( post_content, post_title, user_id, post_status) (“Some Test Post Content”, “JULF Test Post 2”, 9, open). Here, we are trying to test if duplicate post_title is allowed.  This tests whether a UNIQUE constraint exists for the post_title column.</w:t>
+        <w:t xml:space="preserve">* </w:t>
+      </w:r>
+      <w:bookmarkStart w:id="0" w:name="__DdeLink__382_481068113"/>
+      <w:r>
+        <w:rPr>
+          <w:b w:val="false"/>
+          <w:bCs w:val="false"/>
+        </w:rPr>
+        <w:t xml:space="preserve">Create a POST with the following details ( </w:t>
+      </w:r>
+      <w:bookmarkStart w:id="1" w:name="__DdeLink__386_481068113"/>
+      <w:r>
+        <w:rPr>
+          <w:b w:val="false"/>
+          <w:bCs w:val="false"/>
+        </w:rPr>
+        <w:t>post_content, user_id, post_status</w:t>
+      </w:r>
+      <w:bookmarkEnd w:id="1"/>
+      <w:r>
+        <w:rPr>
+          <w:b w:val="false"/>
+          <w:bCs w:val="false"/>
+        </w:rPr>
+        <w:t>) (</w:t>
+      </w:r>
+      <w:bookmarkStart w:id="2" w:name="__DdeLink__388_481068113"/>
+      <w:r>
+        <w:rPr>
+          <w:b w:val="false"/>
+          <w:bCs w:val="false"/>
+        </w:rPr>
+        <w:t>“</w:t>
+      </w:r>
+      <w:bookmarkStart w:id="3" w:name="__DdeLink__390_481068113"/>
+      <w:r>
+        <w:rPr>
+          <w:b w:val="false"/>
+          <w:bCs w:val="false"/>
+        </w:rPr>
+        <w:t>Test Post 2 for user JULF”,  9, open</w:t>
+      </w:r>
+      <w:bookmarkEnd w:id="2"/>
+      <w:r>
+        <w:rPr>
+          <w:b w:val="false"/>
+          <w:bCs w:val="false"/>
+        </w:rPr>
+        <w:t>)</w:t>
+      </w:r>
+      <w:bookmarkEnd w:id="3"/>
+      <w:r>
+        <w:rPr>
+          <w:b w:val="false"/>
+          <w:bCs w:val="false"/>
+        </w:rPr>
+        <w:t>. Here, we are trying to test if duplicate post_content is allowed.</w:t>
+      </w:r>
+      <w:bookmarkEnd w:id="0"/>
+      <w:r>
+        <w:rPr>
+          <w:b w:val="false"/>
+          <w:bCs w:val="false"/>
+        </w:rPr>
+        <w:t xml:space="preserve"> </w:t>
+      </w:r>
+      <w:bookmarkStart w:id="4" w:name="__DdeLink__384_481068113"/>
+      <w:r>
+        <w:rPr>
+          <w:b w:val="false"/>
+          <w:bCs w:val="false"/>
+        </w:rPr>
+        <w:t>This tests whether a UNIQUE constraint exists for the post_content column</w:t>
+      </w:r>
+      <w:bookmarkEnd w:id="4"/>
+      <w:r>
+        <w:rPr>
+          <w:b w:val="false"/>
+          <w:bCs w:val="false"/>
+        </w:rPr>
+        <w:t xml:space="preserve">. </w:t>
       </w:r>
     </w:p>
     <w:p>
@@ -1228,7 +1254,7 @@
           <w:b w:val="false"/>
           <w:bCs w:val="false"/>
         </w:rPr>
-        <w:t>* Delete the POST with post_title “JULF Test Post 2” and post_content “Test Post 2 for user JULF”. This will tell us what happens to the corresponding user when this post is deleted. Here, we are checking referential integrity w.r.t user_id.</w:t>
+        <w:t>* Create a POST with the following details ( post_content, post_title, user_id, post_status) (“Some Test Post Content”, “JULF Test Post 2”, 9, open). Here, we are trying to test if duplicate post_title is allowed.  This tests whether a UNIQUE constraint exists for the post_title column.</w:t>
       </w:r>
     </w:p>
     <w:p>
@@ -1263,8 +1289,45 @@
           <w:b w:val="false"/>
           <w:bCs w:val="false"/>
         </w:rPr>
+        <w:t>* Delete the POST with post_title “JULF Test Post 2” and post_content “Test Post 2 for user JULF”. This will tell us what happens to the corresponding user when this post is deleted. Here, we are checking referential integrity w.r.t user_id.</w:t>
+      </w:r>
+    </w:p>
+    <w:p>
+      <w:pPr>
+        <w:pStyle w:val="Normal"/>
+        <w:bidi w:val="0"/>
+        <w:jc w:val="both"/>
+        <w:rPr>
+          <w:b w:val="false"/>
+          <w:bCs w:val="false"/>
+        </w:rPr>
+      </w:pPr>
+      <w:r>
+        <w:rPr>
+          <w:b w:val="false"/>
+          <w:bCs w:val="false"/>
+        </w:rPr>
+      </w:r>
+    </w:p>
+    <w:p>
+      <w:pPr>
+        <w:pStyle w:val="Normal"/>
+        <w:bidi w:val="0"/>
+        <w:jc w:val="both"/>
+        <w:rPr>
+          <w:b w:val="false"/>
+          <w:bCs w:val="false"/>
+        </w:rPr>
+      </w:pPr>
+      <w:bookmarkStart w:id="5" w:name="__DdeLink__397_481068113"/>
+      <w:r>
+        <w:rPr>
+          <w:b w:val="false"/>
+          <w:bCs w:val="false"/>
+        </w:rPr>
         <w:t>* Create a POST with the following details (post_content, post_title, user_id, post_status) (Test Post 2 for user JULF”, “JULF Test Post 2”  9, open). We are doing this test, so that the deleted post is re-created. This way, we can run these tests repeatedly.</w:t>
       </w:r>
+      <w:bookmarkEnd w:id="5"/>
     </w:p>
     <w:sectPr>
       <w:type w:val="nextPage"/>

</xml_diff>